<commit_message>
docs: registra a variável CRON_SECRET nos manuais
O endpoint da rotina de manutenção fica exposto como qualquer rota do
site. Não devolve dado nenhum, mas sem proteção qualquer um pode chamar
em volume e consumir a cota de execuções do plano gratuito.

A variável foi cadastrada em produção e agora está documentada nos dois
lugares onde alguém procuraria: o manual do banco, com o passo a passo e
como conferir se está ativa, e a tabela de variáveis de ambiente do guia
de transferência, que antes listava só as duas do Supabase.
</commit_message>
<xml_diff>
--- a/docs/Ecoverse - Transferencia do projeto.docx
+++ b/docs/Ecoverse - Transferencia do projeto.docx
@@ -1925,7 +1925,7 @@
           <w:sz w:val="22"/>
           <w:szCs w:val="22"/>
         </w:rPr>
-        <w:t xml:space="preserve">São duas, e as mesmas valem para a hospedagem e para as ações automatizadas do repositório:</w:t>
+        <w:t xml:space="preserve">São três. As duas primeiras valem também para as ações automatizadas do repositório; a terceira é exclusiva da hospedagem:</w:t>
       </w:r>
     </w:p>
     <w:tbl>
@@ -2187,6 +2187,86 @@
                 <w:szCs w:val="20"/>
               </w:rPr>
               <w:t xml:space="preserve">Mesma tela, campo da chave publicável</w:t>
+            </w:r>
+          </w:p>
+        </w:tc>
+      </w:tr>
+      <w:tr>
+        <w:tc>
+          <w:tcPr>
+            <w:tcW w:type="dxa" w:w="3000"/>
+            <w:tcMar>
+              <w:top w:type="dxa" w:w="80"/>
+              <w:left w:type="dxa" w:w="120"/>
+              <w:bottom w:type="dxa" w:w="80"/>
+              <w:right w:type="dxa" w:w="120"/>
+            </w:tcMar>
+          </w:tcPr>
+          <w:p>
+            <w:pPr>
+              <w:spacing w:after="0" w:before="0"/>
+            </w:pPr>
+            <w:r>
+              <w:rPr>
+                <w:rFonts w:ascii="Arial" w:cs="Arial" w:eastAsia="Arial" w:hAnsi="Arial"/>
+                <w:b w:val="false"/>
+                <w:bCs w:val="false"/>
+                <w:sz w:val="20"/>
+                <w:szCs w:val="20"/>
+              </w:rPr>
+              <w:t xml:space="preserve">CRON_SECRET</w:t>
+            </w:r>
+          </w:p>
+        </w:tc>
+        <w:tc>
+          <w:tcPr>
+            <w:tcW w:type="dxa" w:w="3000"/>
+            <w:tcMar>
+              <w:top w:type="dxa" w:w="80"/>
+              <w:left w:type="dxa" w:w="120"/>
+              <w:bottom w:type="dxa" w:w="80"/>
+              <w:right w:type="dxa" w:w="120"/>
+            </w:tcMar>
+          </w:tcPr>
+          <w:p>
+            <w:pPr>
+              <w:spacing w:after="0" w:before="0"/>
+            </w:pPr>
+            <w:r>
+              <w:rPr>
+                <w:rFonts w:ascii="Arial" w:cs="Arial" w:eastAsia="Arial" w:hAnsi="Arial"/>
+                <w:b w:val="false"/>
+                <w:bCs w:val="false"/>
+                <w:sz w:val="20"/>
+                <w:szCs w:val="20"/>
+              </w:rPr>
+              <w:t xml:space="preserve">Protege o endpoint da rotina de manutenção</w:t>
+            </w:r>
+          </w:p>
+        </w:tc>
+        <w:tc>
+          <w:tcPr>
+            <w:tcW w:type="dxa" w:w="2800"/>
+            <w:tcMar>
+              <w:top w:type="dxa" w:w="80"/>
+              <w:left w:type="dxa" w:w="120"/>
+              <w:bottom w:type="dxa" w:w="80"/>
+              <w:right w:type="dxa" w:w="120"/>
+            </w:tcMar>
+          </w:tcPr>
+          <w:p>
+            <w:pPr>
+              <w:spacing w:after="0" w:before="0"/>
+            </w:pPr>
+            <w:r>
+              <w:rPr>
+                <w:rFonts w:ascii="Arial" w:cs="Arial" w:eastAsia="Arial" w:hAnsi="Arial"/>
+                <w:b w:val="false"/>
+                <w:bCs w:val="false"/>
+                <w:sz w:val="20"/>
+                <w:szCs w:val="20"/>
+              </w:rPr>
+              <w:t xml:space="preserve">Cadeia aleatória de 16 caracteres ou mais, gerada por você</w:t>
             </w:r>
           </w:p>
         </w:tc>

</xml_diff>